<commit_message>
adding the modified files of ch05 and the notes doc file
</commit_message>
<xml_diff>
--- a/Notes_data_Analysis_course.docx
+++ b/Notes_data_Analysis_course.docx
@@ -64,7 +64,15 @@
     </w:p>
     <w:p>
       <w:r>
-        <w:t xml:space="preserve">  ️ It has all your </w:t>
+        <w:t xml:space="preserve"> </w:t>
+      </w:r>
+      <w:proofErr w:type="gramStart"/>
+      <w:r>
+        <w:t>It</w:t>
+      </w:r>
+      <w:proofErr w:type="gramEnd"/>
+      <w:r>
+        <w:t xml:space="preserve"> has all your </w:t>
       </w:r>
       <w:r>
         <w:rPr>
@@ -93,17 +101,22 @@
       </w:r>
     </w:p>
     <w:p>
-      <w:r>
-        <w:t xml:space="preserve">  </w:t>
-      </w:r>
-      <w:r>
+      <w:pPr>
         <w:rPr>
-          <w:rFonts w:ascii="Calibri" w:hAnsi="Calibri" w:cs="Calibri"/>
+          <w:b/>
+          <w:bCs/>
         </w:rPr>
-        <w:t>⏱</w:t>
-      </w:r>
-      <w:r>
-        <w:t xml:space="preserve">️ It saves time because you don’t have to install stuff on your computer. You just </w:t>
+      </w:pPr>
+      <w:proofErr w:type="gramStart"/>
+      <w:r>
+        <w:t xml:space="preserve"> </w:t>
+      </w:r>
+      <w:r>
+        <w:t xml:space="preserve"> It</w:t>
+      </w:r>
+      <w:proofErr w:type="gramEnd"/>
+      <w:r>
+        <w:t xml:space="preserve"> saves time because you don’t have to install stuff on your computer. You just </w:t>
       </w:r>
       <w:r>
         <w:rPr>
@@ -113,49 +126,50 @@
         <w:t>click a button, and boom — your code space is ready!</w:t>
       </w:r>
     </w:p>
-    <w:p/>
-    <w:p>
-      <w:r>
-        <w:t>Then I have created a fork of the main project from their github (from github profile)</w:t>
-      </w:r>
-      <w:r>
-        <w:t>. So</w:t>
-      </w:r>
-      <w:r>
-        <w:t xml:space="preserve"> I have this new project created, and then I chose to open it with Visual studio code, </w:t>
-      </w:r>
-      <w:r>
-        <w:t>it</w:t>
-      </w:r>
-      <w:r>
-        <w:t xml:space="preserve"> asked for my login credentials and also I had to give </w:t>
-      </w:r>
-      <w:r>
-        <w:t xml:space="preserve">2 </w:t>
-      </w:r>
-      <w:r>
-        <w:t xml:space="preserve">permissions from </w:t>
-      </w:r>
-      <w:r>
-        <w:t xml:space="preserve">my personal </w:t>
-      </w:r>
-      <w:r>
-        <w:t>GitHub</w:t>
-      </w:r>
-      <w:r>
-        <w:t xml:space="preserve"> account</w:t>
-      </w:r>
-      <w:r>
-        <w:t>.</w:t>
-      </w:r>
-      <w:r>
-        <w:t xml:space="preserve"> I also clicked yes to download the extension to work with github codespace.</w:t>
-      </w:r>
-      <w:r>
-        <w:t>, in vs code.</w:t>
-      </w:r>
+    <w:p>
       <w:bookmarkStart w:id="0" w:name="_GoBack"/>
       <w:bookmarkEnd w:id="0"/>
+    </w:p>
+    <w:p>
+      <w:r>
+        <w:t>Then I have created a fork of the main project from their github (from github profile)</w:t>
+      </w:r>
+      <w:r>
+        <w:t>. So</w:t>
+      </w:r>
+      <w:r>
+        <w:t xml:space="preserve"> I have this new project created, and then I chose to open it with Visual studio code, </w:t>
+      </w:r>
+      <w:r>
+        <w:t>it</w:t>
+      </w:r>
+      <w:r>
+        <w:t xml:space="preserve"> asked for my login credentials and also I had to give </w:t>
+      </w:r>
+      <w:r>
+        <w:t xml:space="preserve">2 </w:t>
+      </w:r>
+      <w:r>
+        <w:t xml:space="preserve">permissions from </w:t>
+      </w:r>
+      <w:r>
+        <w:t xml:space="preserve">my personal </w:t>
+      </w:r>
+      <w:r>
+        <w:t>GitHub</w:t>
+      </w:r>
+      <w:r>
+        <w:t xml:space="preserve"> account</w:t>
+      </w:r>
+      <w:r>
+        <w:t>.</w:t>
+      </w:r>
+      <w:r>
+        <w:t xml:space="preserve"> I also clicked yes to download the extension to work with github codespace.</w:t>
+      </w:r>
+      <w:r>
+        <w:t>, in vs code.</w:t>
+      </w:r>
     </w:p>
     <w:p>
       <w:r>

</xml_diff>

<commit_message>
adding the datastructures ipynb file with lists, tuples (half)
</commit_message>
<xml_diff>
--- a/Notes_data_Analysis_course.docx
+++ b/Notes_data_Analysis_course.docx
@@ -126,10 +126,7 @@
         <w:t>click a button, and boom — your code space is ready!</w:t>
       </w:r>
     </w:p>
-    <w:p>
-      <w:bookmarkStart w:id="0" w:name="_GoBack"/>
-      <w:bookmarkEnd w:id="0"/>
-    </w:p>
+    <w:p/>
     <w:p>
       <w:r>
         <w:t>Then I have created a fork of the main project from their github (from github profile)</w:t>
@@ -507,6 +504,87 @@
       <w:pPr>
         <w:pStyle w:val="NormalWeb"/>
       </w:pPr>
+      <w:r>
+        <w:t xml:space="preserve">The thing is, </w:t>
+      </w:r>
+      <w:proofErr w:type="gramStart"/>
+      <w:r>
+        <w:t>After</w:t>
+      </w:r>
+      <w:proofErr w:type="gramEnd"/>
+      <w:r>
+        <w:t xml:space="preserve"> a couple of days, I don’t remember what I have done. The settings with git, how I worked.</w:t>
+      </w:r>
+    </w:p>
+    <w:p>
+      <w:pPr>
+        <w:pStyle w:val="NormalWeb"/>
+      </w:pPr>
+      <w:r>
+        <w:t>So here I go again;</w:t>
+      </w:r>
+    </w:p>
+    <w:p>
+      <w:pPr>
+        <w:pStyle w:val="NormalWeb"/>
+      </w:pPr>
+      <w:r>
+        <w:t>Now I have opened github and the folder in vs code.</w:t>
+      </w:r>
+    </w:p>
+    <w:p>
+      <w:pPr>
+        <w:pStyle w:val="NormalWeb"/>
+      </w:pPr>
+      <w:r>
+        <w:t xml:space="preserve">So I ran the cell in </w:t>
+      </w:r>
+      <w:proofErr w:type="spellStart"/>
+      <w:r>
+        <w:t>Jup</w:t>
+      </w:r>
+      <w:r>
+        <w:t>y</w:t>
+      </w:r>
+      <w:r>
+        <w:t>ter</w:t>
+      </w:r>
+      <w:proofErr w:type="spellEnd"/>
+      <w:r>
+        <w:t xml:space="preserve"> notebook, and then it asked to choose the </w:t>
+      </w:r>
+      <w:proofErr w:type="gramStart"/>
+      <w:r>
+        <w:t>environment ,</w:t>
+      </w:r>
+      <w:proofErr w:type="gramEnd"/>
+      <w:r>
+        <w:t xml:space="preserve"> I chose the anaconda environment. </w:t>
+      </w:r>
+    </w:p>
+    <w:p>
+      <w:pPr>
+        <w:pStyle w:val="NormalWeb"/>
+      </w:pPr>
+      <w:r>
+        <w:t>“</w:t>
+      </w:r>
+      <w:r>
+        <w:t>Connecting to kernel: base (Python 3.12.7)</w:t>
+      </w:r>
+      <w:r>
+        <w:t>”</w:t>
+      </w:r>
+      <w:bookmarkStart w:id="0" w:name="_GoBack"/>
+      <w:bookmarkEnd w:id="0"/>
+    </w:p>
+    <w:p>
+      <w:pPr>
+        <w:pStyle w:val="NormalWeb"/>
+      </w:pPr>
+      <w:r>
+        <w:t>It activated the environment and then ran the cell.</w:t>
+      </w:r>
     </w:p>
     <w:p>
       <w:pPr>

</xml_diff>

<commit_message>
adding Notes from system_2
</commit_message>
<xml_diff>
--- a/Notes_data_Analysis_course.docx
+++ b/Notes_data_Analysis_course.docx
@@ -1,6 +1,6 @@
 
 <file path=word/document.xml><?xml version="1.0" encoding="utf-8"?>
-<w:document xmlns:wpc="http://schemas.microsoft.com/office/word/2010/wordprocessingCanvas" xmlns:mc="http://schemas.openxmlformats.org/markup-compatibility/2006" xmlns:o="urn:schemas-microsoft-com:office:office" xmlns:r="http://schemas.openxmlformats.org/officeDocument/2006/relationships" xmlns:m="http://schemas.openxmlformats.org/officeDocument/2006/math" xmlns:v="urn:schemas-microsoft-com:vml" xmlns:wp14="http://schemas.microsoft.com/office/word/2010/wordprocessingDrawing" xmlns:wp="http://schemas.openxmlformats.org/drawingml/2006/wordprocessingDrawing" xmlns:w10="urn:schemas-microsoft-com:office:word" xmlns:w="http://schemas.openxmlformats.org/wordprocessingml/2006/main" xmlns:w14="http://schemas.microsoft.com/office/word/2010/wordml" xmlns:w15="http://schemas.microsoft.com/office/word/2012/wordml" xmlns:wpg="http://schemas.microsoft.com/office/word/2010/wordprocessingGroup" xmlns:wpi="http://schemas.microsoft.com/office/word/2010/wordprocessingInk" xmlns:wne="http://schemas.microsoft.com/office/word/2006/wordml" xmlns:wps="http://schemas.microsoft.com/office/word/2010/wordprocessingShape" mc:Ignorable="w14 w15 wp14">
+<w:document xmlns:wpc="http://schemas.microsoft.com/office/word/2010/wordprocessingCanvas" xmlns:cx="http://schemas.microsoft.com/office/drawing/2014/chartex" xmlns:cx1="http://schemas.microsoft.com/office/drawing/2015/9/8/chartex" xmlns:cx2="http://schemas.microsoft.com/office/drawing/2015/10/21/chartex" xmlns:cx3="http://schemas.microsoft.com/office/drawing/2016/5/9/chartex" xmlns:cx4="http://schemas.microsoft.com/office/drawing/2016/5/10/chartex" xmlns:cx5="http://schemas.microsoft.com/office/drawing/2016/5/11/chartex" xmlns:cx6="http://schemas.microsoft.com/office/drawing/2016/5/12/chartex" xmlns:cx7="http://schemas.microsoft.com/office/drawing/2016/5/13/chartex" xmlns:cx8="http://schemas.microsoft.com/office/drawing/2016/5/14/chartex" xmlns:mc="http://schemas.openxmlformats.org/markup-compatibility/2006" xmlns:aink="http://schemas.microsoft.com/office/drawing/2016/ink" xmlns:am3d="http://schemas.microsoft.com/office/drawing/2017/model3d" xmlns:o="urn:schemas-microsoft-com:office:office" xmlns:oel="http://schemas.microsoft.com/office/2019/extlst" xmlns:r="http://schemas.openxmlformats.org/officeDocument/2006/relationships" xmlns:m="http://schemas.openxmlformats.org/officeDocument/2006/math" xmlns:v="urn:schemas-microsoft-com:vml" xmlns:wp14="http://schemas.microsoft.com/office/word/2010/wordprocessingDrawing" xmlns:wp="http://schemas.openxmlformats.org/drawingml/2006/wordprocessingDrawing" xmlns:w10="urn:schemas-microsoft-com:office:word" xmlns:w="http://schemas.openxmlformats.org/wordprocessingml/2006/main" xmlns:w14="http://schemas.microsoft.com/office/word/2010/wordml" xmlns:w15="http://schemas.microsoft.com/office/word/2012/wordml" xmlns:w16cex="http://schemas.microsoft.com/office/word/2018/wordml/cex" xmlns:w16cid="http://schemas.microsoft.com/office/word/2016/wordml/cid" xmlns:w16="http://schemas.microsoft.com/office/word/2018/wordml" xmlns:w16du="http://schemas.microsoft.com/office/word/2023/wordml/word16du" xmlns:w16sdtdh="http://schemas.microsoft.com/office/word/2020/wordml/sdtdatahash" xmlns:w16sdtfl="http://schemas.microsoft.com/office/word/2024/wordml/sdtformatlock" xmlns:w16se="http://schemas.microsoft.com/office/word/2015/wordml/symex" xmlns:wpg="http://schemas.microsoft.com/office/word/2010/wordprocessingGroup" xmlns:wpi="http://schemas.microsoft.com/office/word/2010/wordprocessingInk" xmlns:wne="http://schemas.microsoft.com/office/word/2006/wordml" xmlns:wps="http://schemas.microsoft.com/office/word/2010/wordprocessingShape" mc:Ignorable="w14 w15 w16se w16cid w16 w16cex w16sdtdh w16sdtfl w16du wp14">
   <w:body>
     <w:p>
       <w:r>
@@ -66,13 +66,8 @@
       <w:r>
         <w:t xml:space="preserve"> </w:t>
       </w:r>
-      <w:proofErr w:type="gramStart"/>
-      <w:r>
-        <w:t>It</w:t>
-      </w:r>
-      <w:proofErr w:type="gramEnd"/>
-      <w:r>
-        <w:t xml:space="preserve"> has all your </w:t>
+      <w:r>
+        <w:t xml:space="preserve">It has all your </w:t>
       </w:r>
       <w:r>
         <w:rPr>
@@ -107,16 +102,11 @@
           <w:bCs/>
         </w:rPr>
       </w:pPr>
-      <w:proofErr w:type="gramStart"/>
       <w:r>
         <w:t xml:space="preserve"> </w:t>
       </w:r>
       <w:r>
-        <w:t xml:space="preserve"> It</w:t>
-      </w:r>
-      <w:proofErr w:type="gramEnd"/>
-      <w:r>
-        <w:t xml:space="preserve"> saves time because you don’t have to install stuff on your computer. You just </w:t>
+        <w:t xml:space="preserve"> It saves time because you don’t have to install stuff on your computer. You just </w:t>
       </w:r>
       <w:r>
         <w:rPr>
@@ -286,15 +276,7 @@
     </w:p>
     <w:p>
       <w:r>
-        <w:t>‘</w:t>
-      </w:r>
-      <w:proofErr w:type="gramStart"/>
-      <w:r>
-        <w:t>ascii</w:t>
-      </w:r>
-      <w:proofErr w:type="gramEnd"/>
-      <w:r>
-        <w:t>’: not Unicode; seven-bit only, useful for legacy applications.</w:t>
+        <w:t>‘ascii’: not Unicode; seven-bit only, useful for legacy applications.</w:t>
       </w:r>
     </w:p>
     <w:p/>
@@ -358,208 +340,632 @@
       </w:r>
     </w:p>
     <w:p>
+      <w:r>
+        <w:t xml:space="preserve">NumPy is a fundamental part of the Python ecosystem, and it provides the foundation for many data analysis and numerical libraries in applications, including SciPy for mathematics, Matplotlib for plotting, pandas and </w:t>
+      </w:r>
       <w:proofErr w:type="spellStart"/>
       <w:r>
-        <w:t>NumPy</w:t>
+        <w:t>statsmodels</w:t>
       </w:r>
       <w:proofErr w:type="spellEnd"/>
       <w:r>
-        <w:t xml:space="preserve"> is a fundamental part of the Python ecosystem, and it provides the foundation for many data analysis and numerical libraries in applications, including </w:t>
+        <w:t xml:space="preserve"> for statistics, scikit-learn for machine learning, and scikit-image for image processing. NumPy is also crucial in interfacing with compiled code in C, C++, or Fortran. In addition, if you learn NumPy, you will be able to use deep learning frameworks such as </w:t>
       </w:r>
       <w:proofErr w:type="spellStart"/>
       <w:r>
-        <w:t>SciPy</w:t>
+        <w:t>PyTorch</w:t>
       </w:r>
       <w:proofErr w:type="spellEnd"/>
       <w:r>
-        <w:t xml:space="preserve"> for mathematics, </w:t>
+        <w:t xml:space="preserve"> and JAX, which share the same array interface, as well as specialized array libraries that are interoperable with NumPy. For instance, </w:t>
       </w:r>
       <w:proofErr w:type="spellStart"/>
       <w:r>
-        <w:t>Matplotlib</w:t>
+        <w:t>CuPy</w:t>
       </w:r>
       <w:proofErr w:type="spellEnd"/>
       <w:r>
-        <w:t xml:space="preserve"> for plotting, pandas and </w:t>
+        <w:t xml:space="preserve"> to work with arrays on fast GPUs, </w:t>
       </w:r>
       <w:proofErr w:type="spellStart"/>
       <w:r>
-        <w:t>statsmodels</w:t>
+        <w:t>Dask</w:t>
       </w:r>
       <w:proofErr w:type="spellEnd"/>
       <w:r>
-        <w:t xml:space="preserve"> for statistics, </w:t>
+        <w:t xml:space="preserve"> to spread arrays across computers, </w:t>
       </w:r>
       <w:proofErr w:type="spellStart"/>
       <w:r>
-        <w:t>scikit</w:t>
+        <w:t>Xarray</w:t>
       </w:r>
       <w:proofErr w:type="spellEnd"/>
       <w:r>
-        <w:t xml:space="preserve">-learn for machine learning, and </w:t>
+        <w:t xml:space="preserve"> for arrays with labels, and by </w:t>
       </w:r>
       <w:proofErr w:type="spellStart"/>
       <w:r>
-        <w:t>scikit</w:t>
+        <w:t>PyData</w:t>
       </w:r>
       <w:proofErr w:type="spellEnd"/>
       <w:r>
-        <w:t xml:space="preserve">-image for image processing. </w:t>
+        <w:t>/Sparse for sparse arrays with many zeros and efficient memory layout. So let's talk about how NumPy arrays are different from Python containers. Python variables are often described as labels. They are not little copies in computer memory ready to receive a value. Rather, the values are independent objects with their own space and memory, and Python variables are just names associated with the values. So you can have more than one variable referring to the same object. This mechanism is very flexible, and it makes it possible to have lists and dictionaries with heterogeneous elements. In fact, you can think of a list as a numbered sequence of labels. However, this scheme is not very efficient when we need to deal with many values of the same type. In that case, you want to reserve space in memory and store all the values side by side, and that's exactly what a NumPy array is. Organizing data in this way is both faster and more memory efficient, and it's also necessary to interface Python with other languages such as C or Fortran, which count on data being laid out in memory in this fashion.</w:t>
+      </w:r>
+    </w:p>
+    <w:p>
+      <w:pPr>
+        <w:pStyle w:val="NormalWeb"/>
+      </w:pPr>
+    </w:p>
+    <w:p>
+      <w:pPr>
+        <w:pStyle w:val="NormalWeb"/>
+      </w:pPr>
+      <w:r>
+        <w:t>The thing is, After a couple of days, I don’t remember what I have done. The settings with git, how I worked.</w:t>
+      </w:r>
+    </w:p>
+    <w:p>
+      <w:pPr>
+        <w:pStyle w:val="NormalWeb"/>
+      </w:pPr>
+      <w:r>
+        <w:t>So here I go again;</w:t>
+      </w:r>
+    </w:p>
+    <w:p>
+      <w:pPr>
+        <w:pStyle w:val="NormalWeb"/>
+      </w:pPr>
+      <w:r>
+        <w:t xml:space="preserve">The scenario: I have opened </w:t>
       </w:r>
       <w:proofErr w:type="spellStart"/>
       <w:r>
-        <w:t>NumPy</w:t>
+        <w:t>vscode</w:t>
       </w:r>
       <w:proofErr w:type="spellEnd"/>
       <w:r>
-        <w:t xml:space="preserve"> is also crucial in interfacing with compiled code in C, C++, or </w:t>
+        <w:t xml:space="preserve"> in both Asus and Mac. </w:t>
+      </w:r>
+      <w:r>
+        <w:br/>
+        <w:t xml:space="preserve">Now the </w:t>
+      </w:r>
+      <w:proofErr w:type="spellStart"/>
+      <w:r>
+        <w:t>codespace</w:t>
+      </w:r>
+      <w:proofErr w:type="spellEnd"/>
+      <w:r>
+        <w:t xml:space="preserve"> scenario does not exist. </w:t>
+      </w:r>
+      <w:proofErr w:type="spellStart"/>
+      <w:r>
+        <w:t>Its</w:t>
+      </w:r>
+      <w:proofErr w:type="spellEnd"/>
+      <w:r>
+        <w:t xml:space="preserve"> all in </w:t>
+      </w:r>
+      <w:proofErr w:type="spellStart"/>
+      <w:r>
+        <w:t>github</w:t>
+      </w:r>
+      <w:proofErr w:type="spellEnd"/>
+      <w:r>
+        <w:t xml:space="preserve"> and local workspace.</w:t>
+      </w:r>
+    </w:p>
+    <w:p>
+      <w:pPr>
+        <w:pStyle w:val="NormalWeb"/>
+      </w:pPr>
+      <w:r>
+        <w:t>I have created fork of the original repository. So it has created a version of the original repository called fork repository.</w:t>
+      </w:r>
+    </w:p>
+    <w:p>
+      <w:pPr>
+        <w:pStyle w:val="NormalWeb"/>
+      </w:pPr>
+      <w:r>
+        <w:t>Now I have created 2 folders in my local repository in ASUS, such that the original is in one of the folders and my personal forked repo is in another folder.</w:t>
+      </w:r>
+    </w:p>
+    <w:p>
+      <w:pPr>
+        <w:pStyle w:val="NormalWeb"/>
+      </w:pPr>
+      <w:r>
+        <w:t xml:space="preserve">Now, I am working on my fork repo and that is visible in my </w:t>
+      </w:r>
+      <w:proofErr w:type="spellStart"/>
+      <w:r>
+        <w:t>github</w:t>
+      </w:r>
+      <w:proofErr w:type="spellEnd"/>
+      <w:r>
+        <w:t xml:space="preserve"> account.</w:t>
+      </w:r>
+    </w:p>
+    <w:p>
+      <w:pPr>
+        <w:pStyle w:val="NormalWeb"/>
+        <w:rPr>
+          <w:b/>
+          <w:bCs/>
+          <w:sz w:val="32"/>
+          <w:szCs w:val="32"/>
+        </w:rPr>
+      </w:pPr>
+      <w:r>
+        <w:rPr>
+          <w:b/>
+          <w:bCs/>
+          <w:sz w:val="32"/>
+          <w:szCs w:val="32"/>
+        </w:rPr>
+        <w:t>Some info to reflect on the fork concept in git:</w:t>
+      </w:r>
+    </w:p>
+    <w:p>
+      <w:pPr>
+        <w:pStyle w:val="NormalWeb"/>
+        <w:rPr>
+          <w:lang w:val="en-US"/>
+        </w:rPr>
+      </w:pPr>
+      <w:r>
+        <w:rPr>
+          <w:lang w:val="en-US"/>
+        </w:rPr>
+        <w:t xml:space="preserve">Forks, in the context of software and version control, are essentially copies of a repository. They allow developers to experiment with a project's code without directly </w:t>
+      </w:r>
+      <w:r>
+        <w:rPr>
+          <w:lang w:val="en-US"/>
+        </w:rPr>
+        <w:lastRenderedPageBreak/>
+        <w:t>affecting the original (upstream) repository. This is particularly useful for open-source projects where contributors can fork a repository, make changes, and then propose those changes back to the original project through a </w:t>
+      </w:r>
+      <w:hyperlink r:id="rId5" w:tgtFrame="_blank" w:history="1">
+        <w:r>
+          <w:rPr>
+            <w:rStyle w:val="Hyperlink"/>
+            <w:lang w:val="en-US"/>
+          </w:rPr>
+          <w:t>pull request</w:t>
+        </w:r>
+      </w:hyperlink>
+      <w:r>
+        <w:rPr>
+          <w:lang w:val="en-US"/>
+        </w:rPr>
+        <w:t>. </w:t>
+      </w:r>
+    </w:p>
+    <w:p>
+      <w:pPr>
+        <w:pStyle w:val="NormalWeb"/>
+        <w:rPr>
+          <w:lang w:val="en-US"/>
+        </w:rPr>
+      </w:pPr>
+      <w:r>
+        <w:rPr>
+          <w:lang w:val="en-US"/>
+        </w:rPr>
+        <w:t>Here's a more detailed explanation:</w:t>
+      </w:r>
+    </w:p>
+    <w:p>
+      <w:pPr>
+        <w:pStyle w:val="NormalWeb"/>
+        <w:rPr>
+          <w:lang w:val="en-US"/>
+        </w:rPr>
+      </w:pPr>
+      <w:r>
+        <w:rPr>
+          <w:lang w:val="en-US"/>
+        </w:rPr>
+        <w:t>1. Forking as a Copy:</w:t>
+      </w:r>
+    </w:p>
+    <w:p>
+      <w:pPr>
+        <w:pStyle w:val="NormalWeb"/>
+        <w:numPr>
+          <w:ilvl w:val="0"/>
+          <w:numId w:val="2"/>
+        </w:numPr>
+        <w:rPr>
+          <w:lang w:val="en-US"/>
+        </w:rPr>
+      </w:pPr>
+      <w:r>
+        <w:rPr>
+          <w:lang w:val="en-US"/>
+        </w:rPr>
+        <w:t>When a developer forks a repository, they create a personal copy of that repository under their own account or organization. </w:t>
+      </w:r>
+    </w:p>
+    <w:p>
+      <w:pPr>
+        <w:pStyle w:val="NormalWeb"/>
+        <w:numPr>
+          <w:ilvl w:val="0"/>
+          <w:numId w:val="2"/>
+        </w:numPr>
+        <w:rPr>
+          <w:lang w:val="en-US"/>
+        </w:rPr>
+      </w:pPr>
+      <w:r>
+        <w:rPr>
+          <w:lang w:val="en-US"/>
+        </w:rPr>
+        <w:t>This copy includes all the branches, commits, and tags from the original repository at the time of forking. </w:t>
+      </w:r>
+    </w:p>
+    <w:p>
+      <w:pPr>
+        <w:pStyle w:val="NormalWeb"/>
+        <w:numPr>
+          <w:ilvl w:val="0"/>
+          <w:numId w:val="2"/>
+        </w:numPr>
+        <w:rPr>
+          <w:lang w:val="en-US"/>
+        </w:rPr>
+      </w:pPr>
+      <w:r>
+        <w:rPr>
+          <w:lang w:val="en-US"/>
+        </w:rPr>
+        <w:t>Importantly, the fork remains connected to the original repository, allowing for easy synchronization of changes from the upstream repository. </w:t>
+      </w:r>
+    </w:p>
+    <w:p>
+      <w:pPr>
+        <w:pStyle w:val="NormalWeb"/>
+        <w:rPr>
+          <w:lang w:val="en-US"/>
+        </w:rPr>
+      </w:pPr>
+      <w:r>
+        <w:rPr>
+          <w:lang w:val="en-US"/>
+        </w:rPr>
+        <w:t>2. Why Fork?</w:t>
+      </w:r>
+    </w:p>
+    <w:p>
+      <w:pPr>
+        <w:pStyle w:val="NormalWeb"/>
+        <w:numPr>
+          <w:ilvl w:val="0"/>
+          <w:numId w:val="3"/>
+        </w:numPr>
+        <w:rPr>
+          <w:lang w:val="en-US"/>
+        </w:rPr>
+      </w:pPr>
+      <w:r>
+        <w:rPr>
+          <w:b/>
+          <w:bCs/>
+          <w:lang w:val="en-US"/>
+        </w:rPr>
+        <w:t>Collaboration on Open Source:</w:t>
+      </w:r>
+    </w:p>
+    <w:p>
+      <w:pPr>
+        <w:pStyle w:val="NormalWeb"/>
+        <w:rPr>
+          <w:lang w:val="en-US"/>
+        </w:rPr>
+      </w:pPr>
+      <w:r>
+        <w:rPr>
+          <w:lang w:val="en-US"/>
+        </w:rPr>
+        <w:t>Forks are a cornerstone of collaborative development in open-source projects. They allow anyone to contribute without needing direct write access to the main repository. </w:t>
+      </w:r>
+    </w:p>
+    <w:p>
+      <w:pPr>
+        <w:pStyle w:val="NormalWeb"/>
+        <w:numPr>
+          <w:ilvl w:val="0"/>
+          <w:numId w:val="3"/>
+        </w:numPr>
+        <w:rPr>
+          <w:lang w:val="en-US"/>
+        </w:rPr>
+      </w:pPr>
+      <w:r>
+        <w:rPr>
+          <w:b/>
+          <w:bCs/>
+          <w:lang w:val="en-US"/>
+        </w:rPr>
+        <w:t>Experimentation and Innovation:</w:t>
+      </w:r>
+    </w:p>
+    <w:p>
+      <w:pPr>
+        <w:pStyle w:val="NormalWeb"/>
+        <w:rPr>
+          <w:lang w:val="en-US"/>
+        </w:rPr>
+      </w:pPr>
+      <w:r>
+        <w:rPr>
+          <w:lang w:val="en-US"/>
+        </w:rPr>
+        <w:t>Developers can freely experiment with code in their fork, trying out new features or bug fixes without impacting the original project until they're ready to propose changes. </w:t>
+      </w:r>
+    </w:p>
+    <w:p>
+      <w:pPr>
+        <w:pStyle w:val="NormalWeb"/>
+        <w:numPr>
+          <w:ilvl w:val="0"/>
+          <w:numId w:val="3"/>
+        </w:numPr>
+        <w:rPr>
+          <w:lang w:val="en-US"/>
+        </w:rPr>
+      </w:pPr>
+      <w:r>
+        <w:rPr>
+          <w:b/>
+          <w:bCs/>
+          <w:lang w:val="en-US"/>
+        </w:rPr>
+        <w:t>Starting a New Project:</w:t>
+      </w:r>
+    </w:p>
+    <w:p>
+      <w:pPr>
+        <w:pStyle w:val="NormalWeb"/>
+        <w:rPr>
+          <w:lang w:val="en-US"/>
+        </w:rPr>
+      </w:pPr>
+      <w:r>
+        <w:rPr>
+          <w:lang w:val="en-US"/>
+        </w:rPr>
+        <w:t>Forks can also be used as a starting point for entirely new projects based on existing code. </w:t>
+      </w:r>
+    </w:p>
+    <w:p>
+      <w:pPr>
+        <w:pStyle w:val="NormalWeb"/>
+        <w:rPr>
+          <w:lang w:val="en-US"/>
+        </w:rPr>
+      </w:pPr>
+      <w:r>
+        <w:rPr>
+          <w:lang w:val="en-US"/>
+        </w:rPr>
+        <w:t>3. How it Works in Practice:</w:t>
+      </w:r>
+    </w:p>
+    <w:p>
+      <w:pPr>
+        <w:pStyle w:val="NormalWeb"/>
+        <w:numPr>
+          <w:ilvl w:val="0"/>
+          <w:numId w:val="4"/>
+        </w:numPr>
+        <w:rPr>
+          <w:lang w:val="en-US"/>
+        </w:rPr>
+      </w:pPr>
+      <w:r>
+        <w:rPr>
+          <w:lang w:val="en-US"/>
+        </w:rPr>
+        <w:t>A developer forks the desired repository. </w:t>
+      </w:r>
+    </w:p>
+    <w:p>
+      <w:pPr>
+        <w:pStyle w:val="NormalWeb"/>
+        <w:numPr>
+          <w:ilvl w:val="0"/>
+          <w:numId w:val="4"/>
+        </w:numPr>
+        <w:rPr>
+          <w:lang w:val="en-US"/>
+        </w:rPr>
+      </w:pPr>
+      <w:r>
+        <w:rPr>
+          <w:lang w:val="en-US"/>
+        </w:rPr>
+        <w:t>They then clone the forked repository to their local machine. </w:t>
+      </w:r>
+    </w:p>
+    <w:p>
+      <w:pPr>
+        <w:pStyle w:val="NormalWeb"/>
+        <w:numPr>
+          <w:ilvl w:val="0"/>
+          <w:numId w:val="4"/>
+        </w:numPr>
+        <w:rPr>
+          <w:lang w:val="en-US"/>
+        </w:rPr>
+      </w:pPr>
+      <w:r>
+        <w:rPr>
+          <w:lang w:val="en-US"/>
+        </w:rPr>
+        <w:t>They make their changes on a new branch within their local clone. </w:t>
+      </w:r>
+    </w:p>
+    <w:p>
+      <w:pPr>
+        <w:pStyle w:val="NormalWeb"/>
+        <w:numPr>
+          <w:ilvl w:val="0"/>
+          <w:numId w:val="4"/>
+        </w:numPr>
+        <w:rPr>
+          <w:lang w:val="en-US"/>
+        </w:rPr>
+      </w:pPr>
+      <w:r>
+        <w:rPr>
+          <w:lang w:val="en-US"/>
+        </w:rPr>
+        <w:t>After testing, they push their changes to their forked repository on the remote server (e.g., GitHub). </w:t>
+      </w:r>
+    </w:p>
+    <w:p>
+      <w:pPr>
+        <w:pStyle w:val="NormalWeb"/>
+        <w:numPr>
+          <w:ilvl w:val="0"/>
+          <w:numId w:val="4"/>
+        </w:numPr>
+        <w:rPr>
+          <w:lang w:val="en-US"/>
+        </w:rPr>
+      </w:pPr>
+      <w:r>
+        <w:rPr>
+          <w:lang w:val="en-US"/>
+        </w:rPr>
+        <w:t>Finally, they create a pull request, which is a request to merge their changes from their fork into the original repository. </w:t>
+      </w:r>
+    </w:p>
+    <w:p>
+      <w:pPr>
+        <w:pStyle w:val="NormalWeb"/>
+        <w:rPr>
+          <w:lang w:val="en-US"/>
+        </w:rPr>
+      </w:pPr>
+      <w:r>
+        <w:rPr>
+          <w:lang w:val="en-US"/>
+        </w:rPr>
+        <w:t>4. Forking vs. Branching:</w:t>
+      </w:r>
+    </w:p>
+    <w:p>
+      <w:pPr>
+        <w:pStyle w:val="NormalWeb"/>
+        <w:numPr>
+          <w:ilvl w:val="0"/>
+          <w:numId w:val="5"/>
+        </w:numPr>
+        <w:rPr>
+          <w:lang w:val="en-US"/>
+        </w:rPr>
+      </w:pPr>
+      <w:r>
+        <w:rPr>
+          <w:lang w:val="en-US"/>
+        </w:rPr>
+        <w:t>While both forks and branches allow for separate lines of development, forks are essentially separate repositories, while branches are within the same repository. </w:t>
+      </w:r>
+    </w:p>
+    <w:p>
+      <w:pPr>
+        <w:pStyle w:val="NormalWeb"/>
+        <w:numPr>
+          <w:ilvl w:val="0"/>
+          <w:numId w:val="5"/>
+        </w:numPr>
+        <w:rPr>
+          <w:lang w:val="en-US"/>
+        </w:rPr>
+      </w:pPr>
+      <w:r>
+        <w:rPr>
+          <w:lang w:val="en-US"/>
+        </w:rPr>
+        <w:t>Forks are primarily used for external contributions, while branches are often used for internal development within a team. </w:t>
+      </w:r>
+    </w:p>
+    <w:p>
+      <w:pPr>
+        <w:pStyle w:val="NormalWeb"/>
+        <w:numPr>
+          <w:ilvl w:val="0"/>
+          <w:numId w:val="5"/>
+        </w:numPr>
+        <w:rPr>
+          <w:lang w:val="en-US"/>
+        </w:rPr>
+      </w:pPr>
+      <w:r>
+        <w:rPr>
+          <w:lang w:val="en-US"/>
+        </w:rPr>
+        <w:t xml:space="preserve">If you have </w:t>
       </w:r>
       <w:proofErr w:type="gramStart"/>
       <w:r>
-        <w:t>Fortran</w:t>
+        <w:rPr>
+          <w:lang w:val="en-US"/>
+        </w:rPr>
+        <w:t>write</w:t>
       </w:r>
       <w:proofErr w:type="gramEnd"/>
       <w:r>
-        <w:t xml:space="preserve">. In addition, if you learn </w:t>
+        <w:rPr>
+          <w:lang w:val="en-US"/>
+        </w:rPr>
+        <w:t xml:space="preserve"> access to the original repository, branching is generally preferred for internal development. </w:t>
+      </w:r>
+    </w:p>
+    <w:p>
+      <w:pPr>
+        <w:pStyle w:val="NormalWeb"/>
+      </w:pPr>
+      <w:r>
+        <w:lastRenderedPageBreak/>
+        <w:t xml:space="preserve">Now I have opened </w:t>
       </w:r>
       <w:proofErr w:type="spellStart"/>
       <w:r>
-        <w:t>NumPy</w:t>
+        <w:t>github</w:t>
       </w:r>
       <w:proofErr w:type="spellEnd"/>
       <w:r>
-        <w:t xml:space="preserve">, you will be able to use deep learning frameworks such as </w:t>
+        <w:t xml:space="preserve"> and the folder in vs code.</w:t>
+      </w:r>
+    </w:p>
+    <w:p>
+      <w:pPr>
+        <w:pStyle w:val="NormalWeb"/>
+      </w:pPr>
+      <w:r>
+        <w:t xml:space="preserve">So I ran the cell in </w:t>
       </w:r>
       <w:proofErr w:type="spellStart"/>
       <w:r>
-        <w:t>PyTorch</w:t>
+        <w:t>Jup</w:t>
+      </w:r>
+      <w:r>
+        <w:t>y</w:t>
+      </w:r>
+      <w:r>
+        <w:t>ter</w:t>
       </w:r>
       <w:proofErr w:type="spellEnd"/>
       <w:r>
-        <w:t xml:space="preserve"> and JAX, which share the same array interface, as well as specialized array libraries that are interoperable with </w:t>
-      </w:r>
-      <w:proofErr w:type="spellStart"/>
-      <w:r>
-        <w:t>NumPy</w:t>
-      </w:r>
-      <w:proofErr w:type="spellEnd"/>
-      <w:r>
-        <w:t xml:space="preserve">. For instance, </w:t>
-      </w:r>
-      <w:proofErr w:type="spellStart"/>
-      <w:r>
-        <w:t>CuPy</w:t>
-      </w:r>
-      <w:proofErr w:type="spellEnd"/>
-      <w:r>
-        <w:t xml:space="preserve"> to work with arrays on fast GPUs, </w:t>
-      </w:r>
-      <w:proofErr w:type="spellStart"/>
-      <w:r>
-        <w:t>Dask</w:t>
-      </w:r>
-      <w:proofErr w:type="spellEnd"/>
-      <w:r>
-        <w:t xml:space="preserve"> to spread arrays across computers, </w:t>
-      </w:r>
-      <w:proofErr w:type="spellStart"/>
-      <w:r>
-        <w:t>Xarray</w:t>
-      </w:r>
-      <w:proofErr w:type="spellEnd"/>
-      <w:r>
-        <w:t xml:space="preserve"> for arrays with labels, and by </w:t>
-      </w:r>
-      <w:proofErr w:type="spellStart"/>
-      <w:r>
-        <w:t>PyData</w:t>
-      </w:r>
-      <w:proofErr w:type="spellEnd"/>
-      <w:r>
-        <w:t xml:space="preserve">/Sparse for sparse arrays with many zeros and efficient memory layout. So let's talk about how </w:t>
-      </w:r>
-      <w:proofErr w:type="spellStart"/>
-      <w:r>
-        <w:t>NumPy</w:t>
-      </w:r>
-      <w:proofErr w:type="spellEnd"/>
-      <w:r>
-        <w:t xml:space="preserve"> arrays are different from Python containers. Python variables are often described as labels. They are not little copies in computer memory ready to receive a value. Rather, the values are independent objects with their own space and memory, and Python variables are just names associated with the values. So you can have more than one variable referring to the same object. This mechanism is very flexible, and it makes it possible to have lists and dictionaries with heterogeneous elements. In fact, you can think of a list as a numbered sequence of labels. However, this scheme is not very efficient when we need to deal with many values of the same type. In that case, you want to reserve space in memory and store all the values side by side, and that's exactly what a </w:t>
-      </w:r>
-      <w:proofErr w:type="spellStart"/>
-      <w:r>
-        <w:t>NumPy</w:t>
-      </w:r>
-      <w:proofErr w:type="spellEnd"/>
-      <w:r>
-        <w:t xml:space="preserve"> array is. Organizing data in this way is both faster and more memory efficient, and it's also necessary to interface Python with other languages such as C or Fortran, which count on data being laid out in memory in this fashion.</w:t>
-      </w:r>
-    </w:p>
-    <w:p>
-      <w:pPr>
-        <w:pStyle w:val="NormalWeb"/>
-      </w:pPr>
-    </w:p>
-    <w:p>
-      <w:pPr>
-        <w:pStyle w:val="NormalWeb"/>
-      </w:pPr>
-      <w:r>
-        <w:t xml:space="preserve">The thing is, </w:t>
-      </w:r>
-      <w:proofErr w:type="gramStart"/>
-      <w:r>
-        <w:t>After</w:t>
-      </w:r>
-      <w:proofErr w:type="gramEnd"/>
-      <w:r>
-        <w:t xml:space="preserve"> a couple of days, I don’t remember what I have done. The settings with git, how I worked.</w:t>
-      </w:r>
-    </w:p>
-    <w:p>
-      <w:pPr>
-        <w:pStyle w:val="NormalWeb"/>
-      </w:pPr>
-      <w:r>
-        <w:t>So here I go again;</w:t>
-      </w:r>
-    </w:p>
-    <w:p>
-      <w:pPr>
-        <w:pStyle w:val="NormalWeb"/>
-      </w:pPr>
-      <w:r>
-        <w:t>Now I have opened github and the folder in vs code.</w:t>
-      </w:r>
-    </w:p>
-    <w:p>
-      <w:pPr>
-        <w:pStyle w:val="NormalWeb"/>
-      </w:pPr>
-      <w:r>
-        <w:t xml:space="preserve">So I ran the cell in </w:t>
-      </w:r>
-      <w:proofErr w:type="spellStart"/>
-      <w:r>
-        <w:t>Jup</w:t>
-      </w:r>
-      <w:r>
-        <w:t>y</w:t>
-      </w:r>
-      <w:r>
-        <w:t>ter</w:t>
-      </w:r>
-      <w:proofErr w:type="spellEnd"/>
-      <w:r>
-        <w:t xml:space="preserve"> notebook, and then it asked to choose the </w:t>
-      </w:r>
-      <w:proofErr w:type="gramStart"/>
-      <w:r>
-        <w:t>environment ,</w:t>
-      </w:r>
-      <w:proofErr w:type="gramEnd"/>
-      <w:r>
-        <w:t xml:space="preserve"> I chose the anaconda environment. </w:t>
+        <w:t xml:space="preserve"> notebook, and then it asked to choose the environment , I chose the anaconda environment. </w:t>
       </w:r>
     </w:p>
     <w:p>
@@ -575,8 +981,6 @@
       <w:r>
         <w:t>”</w:t>
       </w:r>
-      <w:bookmarkStart w:id="0" w:name="_GoBack"/>
-      <w:bookmarkEnd w:id="0"/>
     </w:p>
     <w:p>
       <w:pPr>
@@ -608,8 +1012,157 @@
 </file>
 
 <file path=word/numbering.xml><?xml version="1.0" encoding="utf-8"?>
-<w:numbering xmlns:wpc="http://schemas.microsoft.com/office/word/2010/wordprocessingCanvas" xmlns:mc="http://schemas.openxmlformats.org/markup-compatibility/2006" xmlns:o="urn:schemas-microsoft-com:office:office" xmlns:r="http://schemas.openxmlformats.org/officeDocument/2006/relationships" xmlns:m="http://schemas.openxmlformats.org/officeDocument/2006/math" xmlns:v="urn:schemas-microsoft-com:vml" xmlns:wp14="http://schemas.microsoft.com/office/word/2010/wordprocessingDrawing" xmlns:wp="http://schemas.openxmlformats.org/drawingml/2006/wordprocessingDrawing" xmlns:w10="urn:schemas-microsoft-com:office:word" xmlns:w="http://schemas.openxmlformats.org/wordprocessingml/2006/main" xmlns:w14="http://schemas.microsoft.com/office/word/2010/wordml" xmlns:w15="http://schemas.microsoft.com/office/word/2012/wordml" xmlns:wpg="http://schemas.microsoft.com/office/word/2010/wordprocessingGroup" xmlns:wpi="http://schemas.microsoft.com/office/word/2010/wordprocessingInk" xmlns:wne="http://schemas.microsoft.com/office/word/2006/wordml" xmlns:wps="http://schemas.microsoft.com/office/word/2010/wordprocessingShape" mc:Ignorable="w14 w15 wp14">
+<w:numbering xmlns:wpc="http://schemas.microsoft.com/office/word/2010/wordprocessingCanvas" xmlns:cx="http://schemas.microsoft.com/office/drawing/2014/chartex" xmlns:cx1="http://schemas.microsoft.com/office/drawing/2015/9/8/chartex" xmlns:cx2="http://schemas.microsoft.com/office/drawing/2015/10/21/chartex" xmlns:cx3="http://schemas.microsoft.com/office/drawing/2016/5/9/chartex" xmlns:cx4="http://schemas.microsoft.com/office/drawing/2016/5/10/chartex" xmlns:cx5="http://schemas.microsoft.com/office/drawing/2016/5/11/chartex" xmlns:cx6="http://schemas.microsoft.com/office/drawing/2016/5/12/chartex" xmlns:cx7="http://schemas.microsoft.com/office/drawing/2016/5/13/chartex" xmlns:cx8="http://schemas.microsoft.com/office/drawing/2016/5/14/chartex" xmlns:mc="http://schemas.openxmlformats.org/markup-compatibility/2006" xmlns:aink="http://schemas.microsoft.com/office/drawing/2016/ink" xmlns:am3d="http://schemas.microsoft.com/office/drawing/2017/model3d" xmlns:o="urn:schemas-microsoft-com:office:office" xmlns:oel="http://schemas.microsoft.com/office/2019/extlst" xmlns:r="http://schemas.openxmlformats.org/officeDocument/2006/relationships" xmlns:m="http://schemas.openxmlformats.org/officeDocument/2006/math" xmlns:v="urn:schemas-microsoft-com:vml" xmlns:wp14="http://schemas.microsoft.com/office/word/2010/wordprocessingDrawing" xmlns:wp="http://schemas.openxmlformats.org/drawingml/2006/wordprocessingDrawing" xmlns:w10="urn:schemas-microsoft-com:office:word" xmlns:w="http://schemas.openxmlformats.org/wordprocessingml/2006/main" xmlns:w14="http://schemas.microsoft.com/office/word/2010/wordml" xmlns:w15="http://schemas.microsoft.com/office/word/2012/wordml" xmlns:w16cex="http://schemas.microsoft.com/office/word/2018/wordml/cex" xmlns:w16cid="http://schemas.microsoft.com/office/word/2016/wordml/cid" xmlns:w16="http://schemas.microsoft.com/office/word/2018/wordml" xmlns:w16du="http://schemas.microsoft.com/office/word/2023/wordml/word16du" xmlns:w16sdtdh="http://schemas.microsoft.com/office/word/2020/wordml/sdtdatahash" xmlns:w16sdtfl="http://schemas.microsoft.com/office/word/2024/wordml/sdtformatlock" xmlns:w16se="http://schemas.microsoft.com/office/word/2015/wordml/symex" xmlns:wpg="http://schemas.microsoft.com/office/word/2010/wordprocessingGroup" xmlns:wpi="http://schemas.microsoft.com/office/word/2010/wordprocessingInk" xmlns:wne="http://schemas.microsoft.com/office/word/2006/wordml" xmlns:wps="http://schemas.microsoft.com/office/word/2010/wordprocessingShape" mc:Ignorable="w14 w15 w16se w16cid w16 w16cex w16sdtdh w16sdtfl w16du wp14">
   <w:abstractNum w:abstractNumId="0" w15:restartNumberingAfterBreak="0">
+    <w:nsid w:val="153079CC"/>
+    <w:multiLevelType w:val="multilevel"/>
+    <w:tmpl w:val="8EA0F2B8"/>
+    <w:lvl w:ilvl="0">
+      <w:start w:val="1"/>
+      <w:numFmt w:val="bullet"/>
+      <w:lvlText w:val=""/>
+      <w:lvlJc w:val="left"/>
+      <w:pPr>
+        <w:tabs>
+          <w:tab w:val="num" w:pos="720"/>
+        </w:tabs>
+        <w:ind w:left="720" w:hanging="360"/>
+      </w:pPr>
+      <w:rPr>
+        <w:rFonts w:ascii="Symbol" w:hAnsi="Symbol" w:hint="default"/>
+        <w:sz w:val="20"/>
+      </w:rPr>
+    </w:lvl>
+    <w:lvl w:ilvl="1" w:tentative="1">
+      <w:start w:val="1"/>
+      <w:numFmt w:val="bullet"/>
+      <w:lvlText w:val="o"/>
+      <w:lvlJc w:val="left"/>
+      <w:pPr>
+        <w:tabs>
+          <w:tab w:val="num" w:pos="1440"/>
+        </w:tabs>
+        <w:ind w:left="1440" w:hanging="360"/>
+      </w:pPr>
+      <w:rPr>
+        <w:rFonts w:ascii="Courier New" w:hAnsi="Courier New" w:hint="default"/>
+        <w:sz w:val="20"/>
+      </w:rPr>
+    </w:lvl>
+    <w:lvl w:ilvl="2" w:tentative="1">
+      <w:start w:val="1"/>
+      <w:numFmt w:val="bullet"/>
+      <w:lvlText w:val=""/>
+      <w:lvlJc w:val="left"/>
+      <w:pPr>
+        <w:tabs>
+          <w:tab w:val="num" w:pos="2160"/>
+        </w:tabs>
+        <w:ind w:left="2160" w:hanging="360"/>
+      </w:pPr>
+      <w:rPr>
+        <w:rFonts w:ascii="Wingdings" w:hAnsi="Wingdings" w:hint="default"/>
+        <w:sz w:val="20"/>
+      </w:rPr>
+    </w:lvl>
+    <w:lvl w:ilvl="3" w:tentative="1">
+      <w:start w:val="1"/>
+      <w:numFmt w:val="bullet"/>
+      <w:lvlText w:val=""/>
+      <w:lvlJc w:val="left"/>
+      <w:pPr>
+        <w:tabs>
+          <w:tab w:val="num" w:pos="2880"/>
+        </w:tabs>
+        <w:ind w:left="2880" w:hanging="360"/>
+      </w:pPr>
+      <w:rPr>
+        <w:rFonts w:ascii="Wingdings" w:hAnsi="Wingdings" w:hint="default"/>
+        <w:sz w:val="20"/>
+      </w:rPr>
+    </w:lvl>
+    <w:lvl w:ilvl="4" w:tentative="1">
+      <w:start w:val="1"/>
+      <w:numFmt w:val="bullet"/>
+      <w:lvlText w:val=""/>
+      <w:lvlJc w:val="left"/>
+      <w:pPr>
+        <w:tabs>
+          <w:tab w:val="num" w:pos="3600"/>
+        </w:tabs>
+        <w:ind w:left="3600" w:hanging="360"/>
+      </w:pPr>
+      <w:rPr>
+        <w:rFonts w:ascii="Wingdings" w:hAnsi="Wingdings" w:hint="default"/>
+        <w:sz w:val="20"/>
+      </w:rPr>
+    </w:lvl>
+    <w:lvl w:ilvl="5" w:tentative="1">
+      <w:start w:val="1"/>
+      <w:numFmt w:val="bullet"/>
+      <w:lvlText w:val=""/>
+      <w:lvlJc w:val="left"/>
+      <w:pPr>
+        <w:tabs>
+          <w:tab w:val="num" w:pos="4320"/>
+        </w:tabs>
+        <w:ind w:left="4320" w:hanging="360"/>
+      </w:pPr>
+      <w:rPr>
+        <w:rFonts w:ascii="Wingdings" w:hAnsi="Wingdings" w:hint="default"/>
+        <w:sz w:val="20"/>
+      </w:rPr>
+    </w:lvl>
+    <w:lvl w:ilvl="6" w:tentative="1">
+      <w:start w:val="1"/>
+      <w:numFmt w:val="bullet"/>
+      <w:lvlText w:val=""/>
+      <w:lvlJc w:val="left"/>
+      <w:pPr>
+        <w:tabs>
+          <w:tab w:val="num" w:pos="5040"/>
+        </w:tabs>
+        <w:ind w:left="5040" w:hanging="360"/>
+      </w:pPr>
+      <w:rPr>
+        <w:rFonts w:ascii="Wingdings" w:hAnsi="Wingdings" w:hint="default"/>
+        <w:sz w:val="20"/>
+      </w:rPr>
+    </w:lvl>
+    <w:lvl w:ilvl="7" w:tentative="1">
+      <w:start w:val="1"/>
+      <w:numFmt w:val="bullet"/>
+      <w:lvlText w:val=""/>
+      <w:lvlJc w:val="left"/>
+      <w:pPr>
+        <w:tabs>
+          <w:tab w:val="num" w:pos="5760"/>
+        </w:tabs>
+        <w:ind w:left="5760" w:hanging="360"/>
+      </w:pPr>
+      <w:rPr>
+        <w:rFonts w:ascii="Wingdings" w:hAnsi="Wingdings" w:hint="default"/>
+        <w:sz w:val="20"/>
+      </w:rPr>
+    </w:lvl>
+    <w:lvl w:ilvl="8" w:tentative="1">
+      <w:start w:val="1"/>
+      <w:numFmt w:val="bullet"/>
+      <w:lvlText w:val=""/>
+      <w:lvlJc w:val="left"/>
+      <w:pPr>
+        <w:tabs>
+          <w:tab w:val="num" w:pos="6480"/>
+        </w:tabs>
+        <w:ind w:left="6480" w:hanging="360"/>
+      </w:pPr>
+      <w:rPr>
+        <w:rFonts w:ascii="Wingdings" w:hAnsi="Wingdings" w:hint="default"/>
+        <w:sz w:val="20"/>
+      </w:rPr>
+    </w:lvl>
+  </w:abstractNum>
+  <w:abstractNum w:abstractNumId="1" w15:restartNumberingAfterBreak="0">
     <w:nsid w:val="30A571FA"/>
     <w:multiLevelType w:val="hybridMultilevel"/>
     <w:tmpl w:val="044074D6"/>
@@ -721,14 +1274,473 @@
       </w:rPr>
     </w:lvl>
   </w:abstractNum>
-  <w:num w:numId="1">
+  <w:abstractNum w:abstractNumId="2" w15:restartNumberingAfterBreak="0">
+    <w:nsid w:val="57300B49"/>
+    <w:multiLevelType w:val="multilevel"/>
+    <w:tmpl w:val="617E7B2A"/>
+    <w:lvl w:ilvl="0">
+      <w:start w:val="1"/>
+      <w:numFmt w:val="bullet"/>
+      <w:lvlText w:val=""/>
+      <w:lvlJc w:val="left"/>
+      <w:pPr>
+        <w:tabs>
+          <w:tab w:val="num" w:pos="720"/>
+        </w:tabs>
+        <w:ind w:left="720" w:hanging="360"/>
+      </w:pPr>
+      <w:rPr>
+        <w:rFonts w:ascii="Symbol" w:hAnsi="Symbol" w:hint="default"/>
+        <w:sz w:val="20"/>
+      </w:rPr>
+    </w:lvl>
+    <w:lvl w:ilvl="1" w:tentative="1">
+      <w:start w:val="1"/>
+      <w:numFmt w:val="bullet"/>
+      <w:lvlText w:val="o"/>
+      <w:lvlJc w:val="left"/>
+      <w:pPr>
+        <w:tabs>
+          <w:tab w:val="num" w:pos="1440"/>
+        </w:tabs>
+        <w:ind w:left="1440" w:hanging="360"/>
+      </w:pPr>
+      <w:rPr>
+        <w:rFonts w:ascii="Courier New" w:hAnsi="Courier New" w:hint="default"/>
+        <w:sz w:val="20"/>
+      </w:rPr>
+    </w:lvl>
+    <w:lvl w:ilvl="2" w:tentative="1">
+      <w:start w:val="1"/>
+      <w:numFmt w:val="bullet"/>
+      <w:lvlText w:val=""/>
+      <w:lvlJc w:val="left"/>
+      <w:pPr>
+        <w:tabs>
+          <w:tab w:val="num" w:pos="2160"/>
+        </w:tabs>
+        <w:ind w:left="2160" w:hanging="360"/>
+      </w:pPr>
+      <w:rPr>
+        <w:rFonts w:ascii="Wingdings" w:hAnsi="Wingdings" w:hint="default"/>
+        <w:sz w:val="20"/>
+      </w:rPr>
+    </w:lvl>
+    <w:lvl w:ilvl="3" w:tentative="1">
+      <w:start w:val="1"/>
+      <w:numFmt w:val="bullet"/>
+      <w:lvlText w:val=""/>
+      <w:lvlJc w:val="left"/>
+      <w:pPr>
+        <w:tabs>
+          <w:tab w:val="num" w:pos="2880"/>
+        </w:tabs>
+        <w:ind w:left="2880" w:hanging="360"/>
+      </w:pPr>
+      <w:rPr>
+        <w:rFonts w:ascii="Wingdings" w:hAnsi="Wingdings" w:hint="default"/>
+        <w:sz w:val="20"/>
+      </w:rPr>
+    </w:lvl>
+    <w:lvl w:ilvl="4" w:tentative="1">
+      <w:start w:val="1"/>
+      <w:numFmt w:val="bullet"/>
+      <w:lvlText w:val=""/>
+      <w:lvlJc w:val="left"/>
+      <w:pPr>
+        <w:tabs>
+          <w:tab w:val="num" w:pos="3600"/>
+        </w:tabs>
+        <w:ind w:left="3600" w:hanging="360"/>
+      </w:pPr>
+      <w:rPr>
+        <w:rFonts w:ascii="Wingdings" w:hAnsi="Wingdings" w:hint="default"/>
+        <w:sz w:val="20"/>
+      </w:rPr>
+    </w:lvl>
+    <w:lvl w:ilvl="5" w:tentative="1">
+      <w:start w:val="1"/>
+      <w:numFmt w:val="bullet"/>
+      <w:lvlText w:val=""/>
+      <w:lvlJc w:val="left"/>
+      <w:pPr>
+        <w:tabs>
+          <w:tab w:val="num" w:pos="4320"/>
+        </w:tabs>
+        <w:ind w:left="4320" w:hanging="360"/>
+      </w:pPr>
+      <w:rPr>
+        <w:rFonts w:ascii="Wingdings" w:hAnsi="Wingdings" w:hint="default"/>
+        <w:sz w:val="20"/>
+      </w:rPr>
+    </w:lvl>
+    <w:lvl w:ilvl="6" w:tentative="1">
+      <w:start w:val="1"/>
+      <w:numFmt w:val="bullet"/>
+      <w:lvlText w:val=""/>
+      <w:lvlJc w:val="left"/>
+      <w:pPr>
+        <w:tabs>
+          <w:tab w:val="num" w:pos="5040"/>
+        </w:tabs>
+        <w:ind w:left="5040" w:hanging="360"/>
+      </w:pPr>
+      <w:rPr>
+        <w:rFonts w:ascii="Wingdings" w:hAnsi="Wingdings" w:hint="default"/>
+        <w:sz w:val="20"/>
+      </w:rPr>
+    </w:lvl>
+    <w:lvl w:ilvl="7" w:tentative="1">
+      <w:start w:val="1"/>
+      <w:numFmt w:val="bullet"/>
+      <w:lvlText w:val=""/>
+      <w:lvlJc w:val="left"/>
+      <w:pPr>
+        <w:tabs>
+          <w:tab w:val="num" w:pos="5760"/>
+        </w:tabs>
+        <w:ind w:left="5760" w:hanging="360"/>
+      </w:pPr>
+      <w:rPr>
+        <w:rFonts w:ascii="Wingdings" w:hAnsi="Wingdings" w:hint="default"/>
+        <w:sz w:val="20"/>
+      </w:rPr>
+    </w:lvl>
+    <w:lvl w:ilvl="8" w:tentative="1">
+      <w:start w:val="1"/>
+      <w:numFmt w:val="bullet"/>
+      <w:lvlText w:val=""/>
+      <w:lvlJc w:val="left"/>
+      <w:pPr>
+        <w:tabs>
+          <w:tab w:val="num" w:pos="6480"/>
+        </w:tabs>
+        <w:ind w:left="6480" w:hanging="360"/>
+      </w:pPr>
+      <w:rPr>
+        <w:rFonts w:ascii="Wingdings" w:hAnsi="Wingdings" w:hint="default"/>
+        <w:sz w:val="20"/>
+      </w:rPr>
+    </w:lvl>
+  </w:abstractNum>
+  <w:abstractNum w:abstractNumId="3" w15:restartNumberingAfterBreak="0">
+    <w:nsid w:val="694A1A54"/>
+    <w:multiLevelType w:val="multilevel"/>
+    <w:tmpl w:val="8068BD34"/>
+    <w:lvl w:ilvl="0">
+      <w:start w:val="1"/>
+      <w:numFmt w:val="bullet"/>
+      <w:lvlText w:val=""/>
+      <w:lvlJc w:val="left"/>
+      <w:pPr>
+        <w:tabs>
+          <w:tab w:val="num" w:pos="720"/>
+        </w:tabs>
+        <w:ind w:left="720" w:hanging="360"/>
+      </w:pPr>
+      <w:rPr>
+        <w:rFonts w:ascii="Symbol" w:hAnsi="Symbol" w:hint="default"/>
+        <w:sz w:val="20"/>
+      </w:rPr>
+    </w:lvl>
+    <w:lvl w:ilvl="1" w:tentative="1">
+      <w:start w:val="1"/>
+      <w:numFmt w:val="bullet"/>
+      <w:lvlText w:val="o"/>
+      <w:lvlJc w:val="left"/>
+      <w:pPr>
+        <w:tabs>
+          <w:tab w:val="num" w:pos="1440"/>
+        </w:tabs>
+        <w:ind w:left="1440" w:hanging="360"/>
+      </w:pPr>
+      <w:rPr>
+        <w:rFonts w:ascii="Courier New" w:hAnsi="Courier New" w:hint="default"/>
+        <w:sz w:val="20"/>
+      </w:rPr>
+    </w:lvl>
+    <w:lvl w:ilvl="2" w:tentative="1">
+      <w:start w:val="1"/>
+      <w:numFmt w:val="bullet"/>
+      <w:lvlText w:val=""/>
+      <w:lvlJc w:val="left"/>
+      <w:pPr>
+        <w:tabs>
+          <w:tab w:val="num" w:pos="2160"/>
+        </w:tabs>
+        <w:ind w:left="2160" w:hanging="360"/>
+      </w:pPr>
+      <w:rPr>
+        <w:rFonts w:ascii="Wingdings" w:hAnsi="Wingdings" w:hint="default"/>
+        <w:sz w:val="20"/>
+      </w:rPr>
+    </w:lvl>
+    <w:lvl w:ilvl="3" w:tentative="1">
+      <w:start w:val="1"/>
+      <w:numFmt w:val="bullet"/>
+      <w:lvlText w:val=""/>
+      <w:lvlJc w:val="left"/>
+      <w:pPr>
+        <w:tabs>
+          <w:tab w:val="num" w:pos="2880"/>
+        </w:tabs>
+        <w:ind w:left="2880" w:hanging="360"/>
+      </w:pPr>
+      <w:rPr>
+        <w:rFonts w:ascii="Wingdings" w:hAnsi="Wingdings" w:hint="default"/>
+        <w:sz w:val="20"/>
+      </w:rPr>
+    </w:lvl>
+    <w:lvl w:ilvl="4" w:tentative="1">
+      <w:start w:val="1"/>
+      <w:numFmt w:val="bullet"/>
+      <w:lvlText w:val=""/>
+      <w:lvlJc w:val="left"/>
+      <w:pPr>
+        <w:tabs>
+          <w:tab w:val="num" w:pos="3600"/>
+        </w:tabs>
+        <w:ind w:left="3600" w:hanging="360"/>
+      </w:pPr>
+      <w:rPr>
+        <w:rFonts w:ascii="Wingdings" w:hAnsi="Wingdings" w:hint="default"/>
+        <w:sz w:val="20"/>
+      </w:rPr>
+    </w:lvl>
+    <w:lvl w:ilvl="5" w:tentative="1">
+      <w:start w:val="1"/>
+      <w:numFmt w:val="bullet"/>
+      <w:lvlText w:val=""/>
+      <w:lvlJc w:val="left"/>
+      <w:pPr>
+        <w:tabs>
+          <w:tab w:val="num" w:pos="4320"/>
+        </w:tabs>
+        <w:ind w:left="4320" w:hanging="360"/>
+      </w:pPr>
+      <w:rPr>
+        <w:rFonts w:ascii="Wingdings" w:hAnsi="Wingdings" w:hint="default"/>
+        <w:sz w:val="20"/>
+      </w:rPr>
+    </w:lvl>
+    <w:lvl w:ilvl="6" w:tentative="1">
+      <w:start w:val="1"/>
+      <w:numFmt w:val="bullet"/>
+      <w:lvlText w:val=""/>
+      <w:lvlJc w:val="left"/>
+      <w:pPr>
+        <w:tabs>
+          <w:tab w:val="num" w:pos="5040"/>
+        </w:tabs>
+        <w:ind w:left="5040" w:hanging="360"/>
+      </w:pPr>
+      <w:rPr>
+        <w:rFonts w:ascii="Wingdings" w:hAnsi="Wingdings" w:hint="default"/>
+        <w:sz w:val="20"/>
+      </w:rPr>
+    </w:lvl>
+    <w:lvl w:ilvl="7" w:tentative="1">
+      <w:start w:val="1"/>
+      <w:numFmt w:val="bullet"/>
+      <w:lvlText w:val=""/>
+      <w:lvlJc w:val="left"/>
+      <w:pPr>
+        <w:tabs>
+          <w:tab w:val="num" w:pos="5760"/>
+        </w:tabs>
+        <w:ind w:left="5760" w:hanging="360"/>
+      </w:pPr>
+      <w:rPr>
+        <w:rFonts w:ascii="Wingdings" w:hAnsi="Wingdings" w:hint="default"/>
+        <w:sz w:val="20"/>
+      </w:rPr>
+    </w:lvl>
+    <w:lvl w:ilvl="8" w:tentative="1">
+      <w:start w:val="1"/>
+      <w:numFmt w:val="bullet"/>
+      <w:lvlText w:val=""/>
+      <w:lvlJc w:val="left"/>
+      <w:pPr>
+        <w:tabs>
+          <w:tab w:val="num" w:pos="6480"/>
+        </w:tabs>
+        <w:ind w:left="6480" w:hanging="360"/>
+      </w:pPr>
+      <w:rPr>
+        <w:rFonts w:ascii="Wingdings" w:hAnsi="Wingdings" w:hint="default"/>
+        <w:sz w:val="20"/>
+      </w:rPr>
+    </w:lvl>
+  </w:abstractNum>
+  <w:abstractNum w:abstractNumId="4" w15:restartNumberingAfterBreak="0">
+    <w:nsid w:val="699411D6"/>
+    <w:multiLevelType w:val="multilevel"/>
+    <w:tmpl w:val="E04EBF92"/>
+    <w:lvl w:ilvl="0">
+      <w:start w:val="1"/>
+      <w:numFmt w:val="bullet"/>
+      <w:lvlText w:val=""/>
+      <w:lvlJc w:val="left"/>
+      <w:pPr>
+        <w:tabs>
+          <w:tab w:val="num" w:pos="720"/>
+        </w:tabs>
+        <w:ind w:left="720" w:hanging="360"/>
+      </w:pPr>
+      <w:rPr>
+        <w:rFonts w:ascii="Symbol" w:hAnsi="Symbol" w:hint="default"/>
+        <w:sz w:val="20"/>
+      </w:rPr>
+    </w:lvl>
+    <w:lvl w:ilvl="1" w:tentative="1">
+      <w:start w:val="1"/>
+      <w:numFmt w:val="bullet"/>
+      <w:lvlText w:val="o"/>
+      <w:lvlJc w:val="left"/>
+      <w:pPr>
+        <w:tabs>
+          <w:tab w:val="num" w:pos="1440"/>
+        </w:tabs>
+        <w:ind w:left="1440" w:hanging="360"/>
+      </w:pPr>
+      <w:rPr>
+        <w:rFonts w:ascii="Courier New" w:hAnsi="Courier New" w:hint="default"/>
+        <w:sz w:val="20"/>
+      </w:rPr>
+    </w:lvl>
+    <w:lvl w:ilvl="2" w:tentative="1">
+      <w:start w:val="1"/>
+      <w:numFmt w:val="bullet"/>
+      <w:lvlText w:val=""/>
+      <w:lvlJc w:val="left"/>
+      <w:pPr>
+        <w:tabs>
+          <w:tab w:val="num" w:pos="2160"/>
+        </w:tabs>
+        <w:ind w:left="2160" w:hanging="360"/>
+      </w:pPr>
+      <w:rPr>
+        <w:rFonts w:ascii="Wingdings" w:hAnsi="Wingdings" w:hint="default"/>
+        <w:sz w:val="20"/>
+      </w:rPr>
+    </w:lvl>
+    <w:lvl w:ilvl="3" w:tentative="1">
+      <w:start w:val="1"/>
+      <w:numFmt w:val="bullet"/>
+      <w:lvlText w:val=""/>
+      <w:lvlJc w:val="left"/>
+      <w:pPr>
+        <w:tabs>
+          <w:tab w:val="num" w:pos="2880"/>
+        </w:tabs>
+        <w:ind w:left="2880" w:hanging="360"/>
+      </w:pPr>
+      <w:rPr>
+        <w:rFonts w:ascii="Wingdings" w:hAnsi="Wingdings" w:hint="default"/>
+        <w:sz w:val="20"/>
+      </w:rPr>
+    </w:lvl>
+    <w:lvl w:ilvl="4" w:tentative="1">
+      <w:start w:val="1"/>
+      <w:numFmt w:val="bullet"/>
+      <w:lvlText w:val=""/>
+      <w:lvlJc w:val="left"/>
+      <w:pPr>
+        <w:tabs>
+          <w:tab w:val="num" w:pos="3600"/>
+        </w:tabs>
+        <w:ind w:left="3600" w:hanging="360"/>
+      </w:pPr>
+      <w:rPr>
+        <w:rFonts w:ascii="Wingdings" w:hAnsi="Wingdings" w:hint="default"/>
+        <w:sz w:val="20"/>
+      </w:rPr>
+    </w:lvl>
+    <w:lvl w:ilvl="5" w:tentative="1">
+      <w:start w:val="1"/>
+      <w:numFmt w:val="bullet"/>
+      <w:lvlText w:val=""/>
+      <w:lvlJc w:val="left"/>
+      <w:pPr>
+        <w:tabs>
+          <w:tab w:val="num" w:pos="4320"/>
+        </w:tabs>
+        <w:ind w:left="4320" w:hanging="360"/>
+      </w:pPr>
+      <w:rPr>
+        <w:rFonts w:ascii="Wingdings" w:hAnsi="Wingdings" w:hint="default"/>
+        <w:sz w:val="20"/>
+      </w:rPr>
+    </w:lvl>
+    <w:lvl w:ilvl="6" w:tentative="1">
+      <w:start w:val="1"/>
+      <w:numFmt w:val="bullet"/>
+      <w:lvlText w:val=""/>
+      <w:lvlJc w:val="left"/>
+      <w:pPr>
+        <w:tabs>
+          <w:tab w:val="num" w:pos="5040"/>
+        </w:tabs>
+        <w:ind w:left="5040" w:hanging="360"/>
+      </w:pPr>
+      <w:rPr>
+        <w:rFonts w:ascii="Wingdings" w:hAnsi="Wingdings" w:hint="default"/>
+        <w:sz w:val="20"/>
+      </w:rPr>
+    </w:lvl>
+    <w:lvl w:ilvl="7" w:tentative="1">
+      <w:start w:val="1"/>
+      <w:numFmt w:val="bullet"/>
+      <w:lvlText w:val=""/>
+      <w:lvlJc w:val="left"/>
+      <w:pPr>
+        <w:tabs>
+          <w:tab w:val="num" w:pos="5760"/>
+        </w:tabs>
+        <w:ind w:left="5760" w:hanging="360"/>
+      </w:pPr>
+      <w:rPr>
+        <w:rFonts w:ascii="Wingdings" w:hAnsi="Wingdings" w:hint="default"/>
+        <w:sz w:val="20"/>
+      </w:rPr>
+    </w:lvl>
+    <w:lvl w:ilvl="8" w:tentative="1">
+      <w:start w:val="1"/>
+      <w:numFmt w:val="bullet"/>
+      <w:lvlText w:val=""/>
+      <w:lvlJc w:val="left"/>
+      <w:pPr>
+        <w:tabs>
+          <w:tab w:val="num" w:pos="6480"/>
+        </w:tabs>
+        <w:ind w:left="6480" w:hanging="360"/>
+      </w:pPr>
+      <w:rPr>
+        <w:rFonts w:ascii="Wingdings" w:hAnsi="Wingdings" w:hint="default"/>
+        <w:sz w:val="20"/>
+      </w:rPr>
+    </w:lvl>
+  </w:abstractNum>
+  <w:num w:numId="1" w16cid:durableId="1602760178">
+    <w:abstractNumId w:val="1"/>
+  </w:num>
+  <w:num w:numId="2" w16cid:durableId="348215961">
     <w:abstractNumId w:val="0"/>
+  </w:num>
+  <w:num w:numId="3" w16cid:durableId="1273905206">
+    <w:abstractNumId w:val="2"/>
+  </w:num>
+  <w:num w:numId="4" w16cid:durableId="29499167">
+    <w:abstractNumId w:val="3"/>
+  </w:num>
+  <w:num w:numId="5" w16cid:durableId="1533416039">
+    <w:abstractNumId w:val="4"/>
   </w:num>
 </w:numbering>
 </file>
 
 <file path=word/styles.xml><?xml version="1.0" encoding="utf-8"?>
-<w:styles xmlns:mc="http://schemas.openxmlformats.org/markup-compatibility/2006" xmlns:r="http://schemas.openxmlformats.org/officeDocument/2006/relationships" xmlns:w="http://schemas.openxmlformats.org/wordprocessingml/2006/main" xmlns:w14="http://schemas.microsoft.com/office/word/2010/wordml" xmlns:w15="http://schemas.microsoft.com/office/word/2012/wordml" mc:Ignorable="w14 w15">
+<w:styles xmlns:mc="http://schemas.openxmlformats.org/markup-compatibility/2006" xmlns:r="http://schemas.openxmlformats.org/officeDocument/2006/relationships" xmlns:w="http://schemas.openxmlformats.org/wordprocessingml/2006/main" xmlns:w14="http://schemas.microsoft.com/office/word/2010/wordml" xmlns:w15="http://schemas.microsoft.com/office/word/2012/wordml" xmlns:w16cex="http://schemas.microsoft.com/office/word/2018/wordml/cex" xmlns:w16cid="http://schemas.microsoft.com/office/word/2016/wordml/cid" xmlns:w16="http://schemas.microsoft.com/office/word/2018/wordml" xmlns:w16du="http://schemas.microsoft.com/office/word/2023/wordml/word16du" xmlns:w16sdtdh="http://schemas.microsoft.com/office/word/2020/wordml/sdtdatahash" xmlns:w16sdtfl="http://schemas.microsoft.com/office/word/2024/wordml/sdtformatlock" xmlns:w16se="http://schemas.microsoft.com/office/word/2015/wordml/symex" mc:Ignorable="w14 w15 w16se w16cid w16 w16cex w16sdtdh w16sdtfl w16du">
   <w:docDefaults>
     <w:rPrDefault>
       <w:rPr>
@@ -744,7 +1756,7 @@
       </w:pPr>
     </w:pPrDefault>
   </w:docDefaults>
-  <w:latentStyles w:defLockedState="0" w:defUIPriority="99" w:defSemiHidden="0" w:defUnhideWhenUsed="0" w:defQFormat="0" w:count="371">
+  <w:latentStyles w:defLockedState="0" w:defUIPriority="99" w:defSemiHidden="0" w:defUnhideWhenUsed="0" w:defQFormat="0" w:count="376">
     <w:lsdException w:name="Normal" w:uiPriority="0" w:qFormat="1"/>
     <w:lsdException w:name="heading 1" w:uiPriority="9" w:qFormat="1"/>
     <w:lsdException w:name="heading 2" w:semiHidden="1" w:uiPriority="9" w:unhideWhenUsed="1" w:qFormat="1"/>
@@ -1116,6 +2128,11 @@
     <w:lsdException w:name="List Table 5 Dark Accent 6" w:uiPriority="50"/>
     <w:lsdException w:name="List Table 6 Colorful Accent 6" w:uiPriority="51"/>
     <w:lsdException w:name="List Table 7 Colorful Accent 6" w:uiPriority="52"/>
+    <w:lsdException w:name="Mention" w:semiHidden="1" w:unhideWhenUsed="1"/>
+    <w:lsdException w:name="Smart Hyperlink" w:semiHidden="1" w:unhideWhenUsed="1"/>
+    <w:lsdException w:name="Hashtag" w:semiHidden="1" w:unhideWhenUsed="1"/>
+    <w:lsdException w:name="Unresolved Mention" w:semiHidden="1" w:unhideWhenUsed="1"/>
+    <w:lsdException w:name="Smart Link" w:semiHidden="1" w:unhideWhenUsed="1"/>
   </w:latentStyles>
   <w:style w:type="paragraph" w:default="1" w:styleId="Normal">
     <w:name w:val="Normal"/>
@@ -1124,7 +2141,6 @@
   <w:style w:type="character" w:default="1" w:styleId="DefaultParagraphFont">
     <w:name w:val="Default Paragraph Font"/>
     <w:uiPriority w:val="1"/>
-    <w:semiHidden/>
     <w:unhideWhenUsed/>
   </w:style>
   <w:style w:type="table" w:default="1" w:styleId="TableNormal">
@@ -1174,6 +2190,29 @@
       <w:sz w:val="24"/>
       <w:szCs w:val="24"/>
       <w:lang w:eastAsia="en-IN"/>
+    </w:rPr>
+  </w:style>
+  <w:style w:type="character" w:styleId="Hyperlink">
+    <w:name w:val="Hyperlink"/>
+    <w:basedOn w:val="DefaultParagraphFont"/>
+    <w:uiPriority w:val="99"/>
+    <w:unhideWhenUsed/>
+    <w:rsid w:val="008026BF"/>
+    <w:rPr>
+      <w:color w:val="0563C1" w:themeColor="hyperlink"/>
+      <w:u w:val="single"/>
+    </w:rPr>
+  </w:style>
+  <w:style w:type="character" w:styleId="UnresolvedMention">
+    <w:name w:val="Unresolved Mention"/>
+    <w:basedOn w:val="DefaultParagraphFont"/>
+    <w:uiPriority w:val="99"/>
+    <w:semiHidden/>
+    <w:unhideWhenUsed/>
+    <w:rsid w:val="008026BF"/>
+    <w:rPr>
+      <w:color w:val="605E5C"/>
+      <w:shd w:val="clear" w:color="auto" w:fill="E1DFDD"/>
     </w:rPr>
   </w:style>
 </w:styles>

</xml_diff>

<commit_message>
adding the Notes file
</commit_message>
<xml_diff>
--- a/Notes_data_Analysis_course.docx
+++ b/Notes_data_Analysis_course.docx
@@ -988,6 +988,86 @@
       </w:pPr>
       <w:r>
         <w:t>It activated the environment and then ran the cell.</w:t>
+      </w:r>
+    </w:p>
+    <w:p>
+      <w:pPr>
+        <w:pStyle w:val="NormalWeb"/>
+      </w:pPr>
+    </w:p>
+    <w:p>
+      <w:pPr>
+        <w:pStyle w:val="NormalWeb"/>
+      </w:pPr>
+      <w:r>
+        <w:t>Hi, Now I have resolved all the conflicts</w:t>
+      </w:r>
+      <w:r>
+        <w:t xml:space="preserve">, after a series of Push, pull and </w:t>
+      </w:r>
+      <w:proofErr w:type="spellStart"/>
+      <w:r>
+        <w:t>commiting</w:t>
+      </w:r>
+      <w:proofErr w:type="spellEnd"/>
+      <w:r>
+        <w:t xml:space="preserve"> from System1 and System2.</w:t>
+      </w:r>
+    </w:p>
+    <w:p>
+      <w:pPr>
+        <w:pStyle w:val="NormalWeb"/>
+      </w:pPr>
+      <w:r>
+        <w:t>So I have 2 local repo: in System1 and System2.</w:t>
+      </w:r>
+    </w:p>
+    <w:p>
+      <w:pPr>
+        <w:pStyle w:val="NormalWeb"/>
+      </w:pPr>
+      <w:r>
+        <w:t>The repository has one folder containing all the content of the Learning Materials without the .</w:t>
+      </w:r>
+      <w:proofErr w:type="spellStart"/>
+      <w:r>
+        <w:t>Github</w:t>
+      </w:r>
+      <w:proofErr w:type="spellEnd"/>
+      <w:r>
+        <w:t xml:space="preserve"> and other folders.</w:t>
+      </w:r>
+    </w:p>
+    <w:p>
+      <w:pPr>
+        <w:pStyle w:val="NormalWeb"/>
+      </w:pPr>
+      <w:r>
+        <w:t>So now, I can refer them and do my work in any computer.</w:t>
+      </w:r>
+    </w:p>
+    <w:p>
+      <w:pPr>
+        <w:pStyle w:val="NormalWeb"/>
+      </w:pPr>
+      <w:r>
+        <w:t>I can also have it outside the repository to refer in both of the Systems, but it helps if it is in same repo.</w:t>
+      </w:r>
+    </w:p>
+    <w:p>
+      <w:pPr>
+        <w:pStyle w:val="NormalWeb"/>
+      </w:pPr>
+      <w:r>
+        <w:t xml:space="preserve">Just open the folder in </w:t>
+      </w:r>
+      <w:proofErr w:type="spellStart"/>
+      <w:r>
+        <w:t>VScode</w:t>
+      </w:r>
+      <w:proofErr w:type="spellEnd"/>
+      <w:r>
+        <w:t xml:space="preserve"> and start working and push and pull if needed.</w:t>
       </w:r>
     </w:p>
     <w:p>

</xml_diff>